<commit_message>
Remove redundant quotation marks from indented quotes; record the rule
Co-Authored-By: Claude Sonnet 5.5 <noreply@anthropic.com>
</commit_message>
<xml_diff>
--- a/content-src/docx/R G 2000 04 29 Empson.docx
+++ b/content-src/docx/R G 2000 04 29 Empson.docx
@@ -61,7 +61,7 @@
     </w:p>
     <w:p>
       <w:r>
-        <w:t xml:space="preserve">&lt;quote&gt;“It is this deep blankness is the real thing strange.</w:t>
+        <w:t xml:space="preserve">&lt;quote&gt;It is this deep blankness is the real thing strange.</w:t>
       </w:r>
       <w:r>
         <w:br/>
@@ -91,7 +91,7 @@
         <w:br/>
       </w:r>
       <w:r>
-        <w:t xml:space="preserve">You don’t want madhouse and the whole thing there.”&lt;/quote&gt;</w:t>
+        <w:t xml:space="preserve">You don’t want madhouse and the whole thing there.&lt;/quote&gt;</w:t>
       </w:r>
     </w:p>
     <w:p>

</xml_diff>